<commit_message>
created shaker sort class with accompaning tests.
</commit_message>
<xml_diff>
--- a/docs/Project 1 Project Plan.docx
+++ b/docs/Project 1 Project Plan.docx
@@ -127,6 +127,27 @@
           <w:rFonts w:ascii="Times New Roman" w:hAnsi="Times New Roman" w:cs="Times New Roman"/>
         </w:rPr>
         <w:t>Team &amp; Roles</w:t>
+      </w:r>
+    </w:p>
+    <w:p>
+      <w:pPr>
+        <w:ind w:left="720"/>
+        <w:rPr>
+          <w:rFonts w:ascii="Times New Roman" w:hAnsi="Times New Roman" w:cs="Times New Roman"/>
+        </w:rPr>
+      </w:pPr>
+      <w:r>
+        <w:rPr>
+          <w:rFonts w:ascii="Times New Roman" w:hAnsi="Times New Roman" w:cs="Times New Roman"/>
+          <w:u w:val="single"/>
+        </w:rPr>
+        <w:t>Team Name:</w:t>
+      </w:r>
+      <w:r>
+        <w:rPr>
+          <w:rFonts w:ascii="Times New Roman" w:hAnsi="Times New Roman" w:cs="Times New Roman"/>
+        </w:rPr>
+        <w:t xml:space="preserve"> Cowan Yandra Team</w:t>
       </w:r>
     </w:p>
     <w:p>
@@ -774,6 +795,7 @@
         <w:rPr>
           <w:rFonts w:ascii="Times New Roman" w:hAnsi="Times New Roman" w:cs="Times New Roman"/>
         </w:rPr>
+        <w:lastRenderedPageBreak/>
         <w:t>We will use the algs4.jar package from our 2420 Algorithms course.</w:t>
       </w:r>
     </w:p>

</xml_diff>